<commit_message>
20260403 재분류 결과 반영: CLASSIFICATION PRINCIPLE 적용
- docs/index.html: 재분류된 기사로 브리핑 재생성
- monitoring/20260403/: 분류 CSV, LLM 리포트(json/md/docx/xlsx) 갱신

Co-Authored-By: Claude Opus 4.6 <noreply@anthropic.com>
</commit_message>
<xml_diff>
--- a/monitoring/20260403/daily_report_llm_20260403.docx
+++ b/monitoring/20260403/daily_report_llm_20260403.docx
@@ -20,7 +20,7 @@
           <w:color w:val="808080"/>
           <w:sz w:val="18"/>
         </w:rPr>
-        <w:t>생성 모델: claude-sonnet-4-6  |  HIGH+MEDIUM 394건 (해외 190건 / 국내 204건)</w:t>
+        <w:t>생성 모델: claude-sonnet-4-6  |  HIGH+MEDIUM 638건 (해외 291건 / 국내 347건)</w:t>
       </w:r>
     </w:p>
     <w:p/>
@@ -34,7 +34,7 @@
     </w:p>
     <w:p>
       <w:r>
-        <w:t>호르무즈 해협 봉쇄 이후 처음으로 프랑스·일본·오만 선박이 해협을 통과하며 부분적 재개 신호가 나타났고, 한국을 포함한 40여 개국 외교장관이 해협 개방을 논의하는 등 외교적 움직임이 가시화되고 있다. 그러나 이란이 UAE 가스 플랜트와 쿠웨이트 정유시설을 공격하고 통행료(톨) 부과 방식으로 '우호국' 선박에만 통행을 허용하는 등 봉쇄의 선택적 완화 국면이 전개되고 있다. 브렌트유 현물 가격은 한때 배럴당 141달러를 기록하며 2008년 금융위기 이후 최고치를 경신했고, 국내 나프타 수급 불안으로 석유화학 업계의 이달 생산 중단 가능성이 제기되며 편의점 숟가락·빨대 등 생활용품 품귀 현상이 현실화되고 있다. 코스피와 원화는 호르무즈 재개 기대감에 반등했으나, 유류할증료가 이미 3배 수준으로 급등한 가운데 5월 이후 물류비 추가 충격 가능성이 경고되고 있다. 정부는 호르무즈 우회 운임 상승분에 대한 관세 면제 조치를 시행하고 자동차 수출 물류비·유동성 지원에 나섰으며, 여당은 나프타 수급 지원을 위한 추경 검토를 밝혔다.</w:t>
+        <w:t>호르무즈 해협 봉쇄 상황에서 4월 3일 프랑스·일본·오만 선박이 전쟁 개시 이후 처음으로 해협 통과에 성공하며 부분적 통항 재개 신호가 나타났고, 한국과 프랑스 정상이 협력 방안을 논의한 것으로 보인다. 그러나 이란이 '우호국' 선박에 한해 통항을 허용하고 통행료 징수 카드를 꺼내 사실상 차별적 봉쇄를 유지하는 가운데, 브렌트유 현물은 배럴당 141달러까지 치솟아 2008년 금융위기 이후 최고치를 기록했다. 이란 드론이 쿠웨이트 미나알아흐마디 정유소와 UAE 가스플랜트를 타격했다는 보도가 나와 걸프 에너지 인프라 위협이 현실화되고 있으며, 미군 전투기 격추·조종사 낙하산 탈출 보도가 이어지며 미-이란 군사 충돌이 심화되고 있다. 한국 정부는 호르무즈 우회 운송비를 관세에서 한시적으로 제외하는 특단 조치를 시행했고, 국내 정유 4사는 대체 원유 조달 다변화에 총력을 기울이는 중이다. 석유화학 업계는 이달 생산 중단 가능성이 제기되며 기업 신용 하향 우려까지 등장해 공급망 충격이 실물 산업으로 본격 전이되는 양상이다.</w:t>
       </w:r>
     </w:p>
     <w:p/>
@@ -51,7 +51,7 @@
         <w:pStyle w:val="Heading3"/>
       </w:pPr>
       <w:r>
-        <w:t>안보·군사  (HIGH 97 / MEDIUM 134)</w:t>
+        <w:t>안보·군사  (HIGH 136 / MEDIUM 164)</w:t>
       </w:r>
     </w:p>
     <w:p>
@@ -64,7 +64,7 @@
     </w:p>
     <w:p>
       <w:r>
-        <w:t>호르무즈 해협 봉쇄 이후 처음으로 프랑스·일본·오만 선박이 해협을 통과했으며, 이란은 '우호국' 선박에 한해 통행을 허용하고 통행료를 부과하는 방식으로 해협을 관리하고 있다. 이란은 UAE 가스 플랜트와 쿠웨이트 정유시설을 공격한 것으로 보도되어 주변국 에너지 인프라에 대한 위협이 지속되고 있다. 인도는 이란산 원유 도입 재개를 보류하고 제재 대상 유조선의 항로를 중국으로 변경한 것으로 전해졌다. 프랑스와 한국이 호르무즈 해협 재개를 위해 협력하기로 한 것으로 보도되었으며, 일부 분석에서는 이번 봉쇄 위기를 1956년 수에즈 위기와 비교하는 시각도 제기되고 있다.</w:t>
+        <w:t>이란이 '우호국' 선박에 한해 호르무즈 통항을 허용하고 있으며, 터키·프랑스·일본·오만 국적 선박이 실제 통과에 성공한 것으로 보인다. 이란은 동시에 통행료 징수 방침을 밝혀 해협을 경제적 레버리지 수단으로 활용하는 모습이다. 미군 전투기가 이란 영토 상공에서 격추됐다는 보도와 조종사 낙하산 탈출 보고가 이어지며 미-이란 간 직접 군사 충돌이 확인되는 상황이다. 40여 개국 외교장관이 호르무즈 개방을 논의하는 회의를 개최했으며, 트럼프 대통령은 '조만간 호르무즈를 쉽게 열고 석유를 확보해 큰돈을 벌 수 있다'고 발언해 미국의 강경 대응 의지를 시사했다. 카타르와 중국도 호르무즈 긴장 관련 양자 회담을 진행한 것으로 보인다.</w:t>
       </w:r>
     </w:p>
     <w:p>
@@ -77,7 +77,7 @@
     </w:p>
     <w:p>
       <w:r>
-        <w:t>한국을 포함한 40여 개국 외교장관이 호르무즈 해협 개방을 논의하는 회의를 개최했으며, 프랑스와 한국이 해협 재개를 위해 공동 대응하기로 한 것으로 보도되었다. 트럼프 대통령은 호르무즈를 쉽게 열고 석유를 확보해 큰돈을 벌 수 있다고 발언하며 동맹국에 대한 압박 가능성이 제기되고 있다. 코스피와 원화는 호르무즈 재개 기대감에 반등하는 등 해협 상황이 국내 금융시장에 직접적인 영향을 미치고 있다.</w:t>
+        <w:t>한국과 프랑스 정상이 호르무즈 해협 재개방을 위해 협력하기로 한 것이 대만·미국 매체를 통해 보도되어 한국의 외교적 역할이 확대되는 모습이다. 트럼프 대통령의 호르무즈 개방 발언이 한국을 포함한 동맹국에 대한 압박으로 해석되는 보도도 국내에서 나왔다. 40여 개국 외교장관 회의에 한국이 참여한 것으로 보이며, 해협 재개방을 위한 다자 외교가 진행 중인 것으로 보인다. 서울 주식시장은 호르무즈 재개방 기대감에 근 3% 반등하며 외교 진전에 민감하게 반응했다.</w:t>
       </w:r>
     </w:p>
     <w:p>
@@ -85,7 +85,7 @@
         <w:pStyle w:val="Heading3"/>
       </w:pPr>
       <w:r>
-        <w:t>운임·물류비  (HIGH 7 / MEDIUM 7)</w:t>
+        <w:t>해양안전  (HIGH 0 / MEDIUM 2)</w:t>
       </w:r>
     </w:p>
     <w:p>
@@ -98,7 +98,7 @@
     </w:p>
     <w:p>
       <w:r>
-        <w:t>일본 소유 LNG 탱커를 포함한 복수의 선박이 호르무즈 해협을 통과했으며, 인도 국적 선박 3척도 추가 도착이 예상되는 것으로 보도되었다. 컨테이너 운임은 공급 과잉(capacity glut)이 호르무즈 충격을 일부 상쇄하면서 상승세가 정체된 것으로 나타났다. 인도 바스마티 쌀 수출업체들은 전쟁으로 인한 물류 혼란으로 해운사들이 추가 요금을 부과하고 있다며 구제를 요청하고 있다. 탱커 시장에 대해서는 중동 리스크에도 불구하고 긍정적 전망이 제시된 것으로 보도되었다.</w:t>
+        <w:t>스코틀랜드에서 억류됐던 탱커의 선원들이 석방된 것으로 보이며, 우크라이나 보안국(SBU)이 이들을 수배한 상황이다. 발트해에서는 러시아 유조선이 기름을 유출해 스웨덴 당국에 억류됐다는 보도가 국내에서 나왔다.</w:t>
       </w:r>
     </w:p>
     <w:p>
@@ -111,7 +111,7 @@
     </w:p>
     <w:p>
       <w:r>
-        <w:t>국내 유류할증료가 이미 3배 수준으로 급등한 것으로 보도되었으며, 5월 이후 추가적인 물류비 충격 가능성이 경고되고 있다. 정부는 호르무즈 우회 운임 상승분을 관세 산정에서 면제하는 조치를 시행했으며, 종량제봉투 품질검수 기간도 10일에서 1일로 단축하는 등 공급망 대응에 나섰다. 아마존과 우체국도 유류할증료를 도입한 것으로 보도되어 물류비 상승이 전방위로 확산되고 있다. 유통업계는 물류비·원가 상승의 직격탄을 맞고 있으며, 컨테이너 부족 현상도 가시화되고 있는 것으로 보인다.</w:t>
+        <w:t>발트해 러시아 유조선 기름 유출 및 억류 사태는 직접적인 한국 영향이 확인되지 않으나, 호르무즈 봉쇄와 맞물려 글로벌 유조선 운항 리스크가 복수 해역으로 확산되는 상황으로 보인다. 한국의 원유 수입선 다변화 과정에서 대체 항로의 안전성 모니터링이 더욱 중요해질 가능성이 있다.</w:t>
       </w:r>
     </w:p>
     <w:p>
@@ -119,7 +119,7 @@
         <w:pStyle w:val="Heading3"/>
       </w:pPr>
       <w:r>
-        <w:t>항만·화물  (HIGH 2 / MEDIUM 4)</w:t>
+        <w:t>운임·물류비  (HIGH 10 / MEDIUM 6)</w:t>
       </w:r>
     </w:p>
     <w:p>
@@ -132,7 +132,7 @@
     </w:p>
     <w:p>
       <w:r>
-        <w:t>방글라데시 정부는 LNG 화물 3건을 추가 긴급 구매에 나섰으며, 싱가포르발 선박이 치타공항에 2만 7,300톤의 디젤을 반입했다. 인도 인디안오일은 LPG 공급이 안정적이라고 밝히며 패닉 구매를 자제할 것을 당부했다.</w:t>
+        <w:t>호르무즈 쇼크에도 불구하고 컨테이너 운임은 공급 과잉(Capacity Glut)이 충격을 일부 상쇄하며 정체 상태를 유지하고 있다는 분석이 나왔다. 인도에서는 바스마티 쌀 수출업체들이 분쟁에 따른 운항 교란으로 선사들이 부과하는 할증료 면제를 요청하는 상황이다. 루비오 미 국무장관은 중국이 파나마 국기 선박을 억류해 '괴롭히고 있다'고 비난했으며, 파나마운하 관련 갈등도 병존하는 모습이다.</w:t>
       </w:r>
     </w:p>
     <w:p>
@@ -145,7 +145,7 @@
     </w:p>
     <w:p>
       <w:r>
-        <w:t>한국 정부는 비료 5개월치를 확보한 것으로 보도되었으며, 곡물 가격 상승 시 사료·육류 가격의 연쇄 인상 가능성이 제기되고 있다. 석유 대리점들은 최고가격제로 인해 유통비가 막혀 공급 중단 및 폐업 위기에 처했다고 호소하고 있다.</w:t>
+        <w:t>한국 정부는 호르무즈 우회 운송비 상승분을 관세에서 한시적으로 제외하는 조치를 발표하며 수입업체의 비용 부담 완화를 도모하고 있다. 아마존과 우체국이 유류 할증료를 도입했다는 보도가 나왔으며, 유류 할증료가 이미 3배 올랐다는 보도도 있어 소비자 물가에 대한 파급이 진행 중인 것으로 보인다. 정부는 공급망 병목 해소를 위해 종량제 봉투 등 생활용품 검수 기간을 10일에서 1일로 단축하는 조치도 병행했다. 5월에 더 큰 문제가 발생할 가능성이 있다는 보도가 나와 단기 완화 조치에도 불구하고 중기 운임 압박 리스크는 지속될 것으로 보인다.</w:t>
       </w:r>
     </w:p>
     <w:p>
@@ -153,7 +153,7 @@
         <w:pStyle w:val="Heading3"/>
       </w:pPr>
       <w:r>
-        <w:t>경제·금융  (HIGH 7 / MEDIUM 63)</w:t>
+        <w:t>항만·화물  (HIGH 4 / MEDIUM 3)</w:t>
       </w:r>
     </w:p>
     <w:p>
@@ -166,7 +166,7 @@
     </w:p>
     <w:p>
       <w:r>
-        <w:t>브렌트유 현물 가격이 한때 배럴당 141달러를 기록하며 2008년 금융위기 이후 최고치를 경신했으며, WTI 원유는 트럼프의 가격 상한 시도에도 불구하고 브렌트를 상회하는 이례적 현상이 나타났다. 이란 공격 이후 근월물 유가가 원월물 대비 기록적인 프리미엄을 형성하는 등 공급 불안이 극도로 고조되고 있다. 미국 소비자 심리지수는 전쟁과 유가 위기 속에 역대 세 번째로 낮은 수준으로 급락했으며, EU 연료 가격도 이란 전쟁으로 인한 공급 압박으로 계속 상승하고 있다. 방글라데시 정부는 에너지 위기로 인해 근무 시간 단축 및 조기 폐점 조치를 시행했으며, UN은 중동 분쟁으로 인한 에너지 비용 상승이 3월 식품 가격 급등을 초래했다고 밝혔다. 유가 150달러 돌파 우려도 제기되고 있으며, 고유가발 인플레이션 압력으로 일본 국채금리가 27년 만에 최고치를 기록했다.</w:t>
+        <w:t>방글라데시 정부가 추가 LNG 화물 3건을 긴급 조달하는 것으로 보이며, 호르무즈 봉쇄에 따른 LNG 수급 불안이 아시아 전역으로 확산되는 모습이다. 호주는 원유 및 정제유 대체 공급원 확보에 나선 것으로 보인다.</w:t>
       </w:r>
     </w:p>
     <w:p>
@@ -179,7 +179,7 @@
     </w:p>
     <w:p>
       <w:r>
-        <w:t>코스피와 원화는 호르무즈 재개 기대감에 각각 약 3% 반등했으나, 브렌트유 현물이 141달러까지 치솟으며 공급 불안이 최고조에 달한 상황이다. 한전KPS는 자원안보 위기 극복을 위한 대국민 에너지 절약 캠페인을 전개하고 있으며, 증평군 등 지방정부도 중동 사태 비상경제대응 점검회의를 진행하고 있다. 고유가발 인플레이션 압력이 국내 물가 전반에 확산될 가능성이 있으며, 에너지 슈퍼 트릴레마 상황에서 한국의 생존 전략 논의가 본격화되고 있는 것으로 보인다.</w:t>
+        <w:t>한국 정부는 비료 5개월치를 확보하는 조치를 취했으며, 곡물가 상승 시 사료·육류 가격이 줄줄이 오를 가능성이 있다는 분석이 나왔다. 원유 위기경보가 '주의'에서 '경계'로 격상됐으며, 여수 원유부두가 정적이 감도는 상황이라는 보도가 있어 실물 물동량 감소가 나타나는 것으로 보인다. 국내 정유 4사는 지역 불문 원유 조달 다변화에 총력을 기울이고 있으며, 울산항만공사는 중국·일본과 국제 급유 협력체계를 확대하고 친환경 연료 급유 지원금(최대 1,000만 원)을 도입했다.</w:t>
       </w:r>
     </w:p>
     <w:p>
@@ -187,7 +187,7 @@
         <w:pStyle w:val="Heading3"/>
       </w:pPr>
       <w:r>
-        <w:t>해운  (HIGH 0 / MEDIUM 6)</w:t>
+        <w:t>경제·금융  (HIGH 17 / MEDIUM 109)</w:t>
       </w:r>
     </w:p>
     <w:p>
@@ -200,7 +200,7 @@
     </w:p>
     <w:p>
       <w:r>
-        <w:t>CMA CGM이 한국에서 건조된 메탄올 추진 컨테이너선을 인도받은 것으로 보도되었다.</w:t>
+        <w:t>브렌트유 현물이 배럴당 141달러까지 치솟아 2008년 금융위기 이후 최고치를 기록했으며, 150달러 돌파 가능성도 경고되고 있다. 미국은 유가가 배럴당 112달러를 넘어서자 전략비축유(SPR) 1,000만 배럴을 방출했다. 캐나다에서는 디젤 가격이 사상 최고치를 기록했으며, EU 연료 가격도 계속 오르고 있다는 보도가 나왔다. 미국 VIX 지수는 23.87로 하락하며 지정학적 긴장 완화 기대와 AI 낙관론에 힘입어 시장이 일부 안정을 찾는 모습이다. JP모건 제이미 다이먼 회장은 이란과의 전쟁이 불가피했다고 언급하며 중동 사태의 경제적 파급을 분석한 것으로 보인다.</w:t>
       </w:r>
     </w:p>
     <w:p>
@@ -213,7 +213,7 @@
     </w:p>
     <w:p>
       <w:r>
-        <w:t>1분기 상선 수주 실적에서 HD현대중공업은 양호한 성과를 보인 반면 한화오션은 다소 부진했으며, LNG 운반선 수주가 주목받고 있다. 울산항만공사는 중·일과의 국제 급유 협력체계를 확대하고, 친환경 연료 급유 선박에 최대 1,000만 원의 인센티브를 도입했다. 해운업의 부산 이전 논의가 정치적 관점이 아닌 산업 논리로 검토되어야 한다는 의견도 제기되고 있다.</w:t>
+        <w:t>브렌트유 현물 141달러 기록에 국내 기름값이 리터당 2,000원에 근접했다는 보도가 나와 소비자 부담이 현실화되고 있다. 코스피와 원화는 호르무즈 통항 재개 기대감에 근 3% 반등했으나, 이는 봉쇄 직전 대비 큰 폭 하락 이후의 반등으로 보인다. 전쟁 장기화 우려가 지속될 경우 유가 117달러 수준의 에너지 공급망 리스크가 언급되고 있어 하방 압력이 구조적으로 남아 있는 상황이다.</w:t>
       </w:r>
     </w:p>
     <w:p>
@@ -221,7 +221,20 @@
         <w:pStyle w:val="Heading3"/>
       </w:pPr>
       <w:r>
-        <w:t>물류  (HIGH 0 / MEDIUM 3)</w:t>
+        <w:t>해운  (HIGH 29 / MEDIUM 14)</w:t>
+      </w:r>
+    </w:p>
+    <w:p>
+      <w:r>
+        <w:rPr>
+          <w:b/>
+        </w:rPr>
+        <w:t>🌐 해외 상황</w:t>
+      </w:r>
+    </w:p>
+    <w:p>
+      <w:r>
+        <w:t>이란과의 전쟁 개시 이후 처음으로 프랑스 소유 컨테이너선, 일본 상선미쓰이 소유 LNG 운반선, 오만 선박이 호르무즈 해협 통과에 성공한 것이 복수 매체를 통해 확인됐다. 인도 국기를 단 선박 3척도 추가로 통과할 예정이며 1척은 이미 통과한 것으로 보인다. 인도의 LPG 탱커가 이란의 고위험 회랑을 항행해 봉쇄를 돌파한 사례도 보도됐다. 이란은 '우호국' 선박에 대해서만 통항을 허용하는 선별적 접근 방식을 취하고 있는 것으로 보인다.</w:t>
       </w:r>
     </w:p>
     <w:p>
@@ -234,7 +247,7 @@
     </w:p>
     <w:p>
       <w:r>
-        <w:t>정부는 중동 리스크에 대응해 자동차 수출 물류비 및 유동성 지원 방안을 마련했다. 인천 중소기업들은 물류 피해가 원자재 분야로 확산되고 있다고 호소하고 있다. 현대글로비스는 레드에너지를 상대로 한 3,000만 달러 규모 소송에서 승소 판결을 받은 것으로 보도되었다.</w:t>
+        <w:t>일본·프랑스 선박이 통과에 성공했으나 한국 선박의 통과 여부는 아직 확인되지 않았으며, '日도, 프랑스도 뚫었는데 韓은?'이라는 보도가 나올 만큼 한국 해운 업계의 통항 재개가 주요 관심사로 부상했다. 호르무즈가 일부 개방되더라도 해상 공급망 혼란이 수개월 이상 지속될 것이라는 전망이 국내에서 보도됐다. HMM 등 국내 해운사의 노선 정상화 시점 및 대체 항로 운영 관련 동향에 대한 모니터링이 필요한 상황으로 보인다.</w:t>
       </w:r>
     </w:p>
     <w:p>
@@ -242,7 +255,7 @@
         <w:pStyle w:val="Heading3"/>
       </w:pPr>
       <w:r>
-        <w:t>기타 산업  (HIGH 16 / MEDIUM 48)</w:t>
+        <w:t>물류  (HIGH 5 / MEDIUM 6)</w:t>
       </w:r>
     </w:p>
     <w:p>
@@ -255,7 +268,7 @@
     </w:p>
     <w:p>
       <w:r>
-        <w:t>이란-미국 전쟁의 영향으로 콘돔 등 석유화학 기반 원자재 부족이 예상된다는 보도가 나왔으며, 아부다비 알루미늄 생산 정상화에 최대 1년이 소요될 수 있다는 전망이 제시되었다. 러시아는 인도에 대한 원유·LNG 공급 확대 의사를 밝혔으며, 파키스탄은 LNG 잉여 상황에서 공급 부족 위기로 전환될 가능성이 제기되고 있다. JERA의 미국 Commonwealth LNG와의 구매 계약이 종료된 것으로 DOE 신고를 통해 확인되었다.</w:t>
+        <w:t>현대자동차가 서아시아 분쟁으로 인한 해운 차질로 수출 물류에 차질이 발생하고 있다고 밝혔으며, 이는 인도 매체를 통해 보도됐다.</w:t>
       </w:r>
     </w:p>
     <w:p>
@@ -268,7 +281,41 @@
     </w:p>
     <w:p>
       <w:r>
-        <w:t>나프타 수급 불안으로 석유화학 업계의 이달 생산 중단 가능성이 제기되었으며, 나프타 가격이 이미 82% 폭등했다는 보도도 나왔다. 편의점 숟가락·빨대 등 합성수지 기반 생활용품의 발주 중단 및 품귀 현상이 현실화되고 있으며, 4월 '나프타 쇼크'가 생활 물가 전방위 압박으로 이어지고 있다. 여당은 추경을 통한 나프타 수급 지원 검토와 3·4월 합성수지 가격 인상 폭 완화 방안을 밝혔으며, 중동 사태 장기화로 기업 신용등급 하향 우려도 제기되고 있다. 원유에 이어 비료 공급 충격으로 올해 작황에 적신호가 켜지고 글로벌 식량위기 우려도 확산되고 있다.</w:t>
+        <w:t>한국 정부는 자동차 수출 물류비 지원 및 유동성 지원 방안을 마련하며 중동 리스크에 대응하고 있다. 인천 소재 중소기업의 피해가 물류 분야에서 원자재 분야로 확산되고 있다는 보도가 나왔다. 유통업계는 물류비·원가 쇼크를 직격탄으로 맞고 있으며, 장기화 시 추가 충격이 우려된다는 분석이 나왔다. UPS는 호르무즈 사태에 대응해 인천공항 물류센터를 기존 대비 4배 확장하며 프리미엄 화물 전략으로 선회하는 모습이다.</w:t>
+      </w:r>
+    </w:p>
+    <w:p>
+      <w:pPr>
+        <w:pStyle w:val="Heading3"/>
+      </w:pPr>
+      <w:r>
+        <w:t>기타 산업  (HIGH 49 / MEDIUM 83)</w:t>
+      </w:r>
+    </w:p>
+    <w:p>
+      <w:r>
+        <w:rPr>
+          <w:b/>
+        </w:rPr>
+        <w:t>🌐 해외 상황</w:t>
+      </w:r>
+    </w:p>
+    <w:p>
+      <w:r>
+        <w:t>이란이 UAE 가스플랜트와 쿠웨이트 미나알아흐마디 정유소를 드론으로 타격했다는 보도가 복수 매체에서 확인됐으며, 쿠웨이트 정유소 화재와 조업 위협이 보도됐다. 아부다비의 알루미늄 생산 정상화에 최대 1년이 소요될 수 있다는 분석이 나왔다. 인도의 러시아산 원유 수입이 3월 기준 90% 급증해 호르무즈 봉쇄로 인한 원유 조달 재편이 진행 중인 것으로 보인다. 석유화학 원료 기반 콘돔 등 생활용품 부족 가능성도 언급되며 공급망 교란 범위가 광범위해지는 모습이다.</w:t>
+      </w:r>
+    </w:p>
+    <w:p>
+      <w:r>
+        <w:rPr>
+          <w:b/>
+        </w:rPr>
+        <w:t>🇰🇷 국내 영향</w:t>
+      </w:r>
+    </w:p>
+    <w:p>
+      <w:r>
+        <w:t>국내 석유화학 업계는 이달 생산 중단 가능성이 제기되고 있으며, 기업 신용 하향 우려도 등장했다. 국내 정유 4사는 1분기 흑자를 기록했음에도 향후 마진 압박 우려로 '실적 착시'라는 분석이 나왔다. 석유 다소비 업체들이 연간 95만 6,000배럴의 석유 절감 목표를 세우며 소비 감축에 나서고 있다. 비료 쇼크로 올해 작황에 적신호가 켜졌으며 '지구촌 기근' 우려가 제기되는 한편, 국내 에너지 공급망의 구조적 취약성 문제가 이번 사태를 계기로 다시 부각되고 있다.</w:t>
       </w:r>
     </w:p>
     <w:p>
@@ -353,7 +400,7 @@
           </w:tcPr>
           <w:p>
             <w:r>
-              <w:t>1962</w:t>
+              <w:t>2962</w:t>
             </w:r>
           </w:p>
         </w:tc>
@@ -385,7 +432,7 @@
           </w:tcPr>
           <w:p>
             <w:r>
-              <w:t>129</w:t>
+              <w:t>250</w:t>
             </w:r>
           </w:p>
         </w:tc>
@@ -395,7 +442,7 @@
           </w:tcPr>
           <w:p>
             <w:r>
-              <w:t>6.6%</w:t>
+              <w:t>8.4%</w:t>
             </w:r>
           </w:p>
         </w:tc>
@@ -417,7 +464,7 @@
           </w:tcPr>
           <w:p>
             <w:r>
-              <w:t>265</w:t>
+              <w:t>388</w:t>
             </w:r>
           </w:p>
         </w:tc>
@@ -427,7 +474,7 @@
           </w:tcPr>
           <w:p>
             <w:r>
-              <w:t>13.5%</w:t>
+              <w:t>13.1%</w:t>
             </w:r>
           </w:p>
         </w:tc>
@@ -449,7 +496,7 @@
           </w:tcPr>
           <w:p>
             <w:r>
-              <w:t>278</w:t>
+              <w:t>493</w:t>
             </w:r>
           </w:p>
         </w:tc>
@@ -459,7 +506,7 @@
           </w:tcPr>
           <w:p>
             <w:r>
-              <w:t>14.2%</w:t>
+              <w:t>16.6%</w:t>
             </w:r>
           </w:p>
         </w:tc>
@@ -481,7 +528,7 @@
           </w:tcPr>
           <w:p>
             <w:r>
-              <w:t>1290</w:t>
+              <w:t>1831</w:t>
             </w:r>
           </w:p>
         </w:tc>
@@ -491,7 +538,7 @@
           </w:tcPr>
           <w:p>
             <w:r>
-              <w:t>65.7%</w:t>
+              <w:t>61.8%</w:t>
             </w:r>
           </w:p>
         </w:tc>

</xml_diff>